<commit_message>
primer cambio: se agrego las ultimas capturas de la tarea
</commit_message>
<xml_diff>
--- a/TAREA 1/ACTIVIDAD 1.docx
+++ b/TAREA 1/ACTIVIDAD 1.docx
@@ -5456,10 +5456,11 @@
           <w:rStyle w:val="Textoennegrita"/>
           <w:rFonts w:ascii="Arial" w:hAnsi="Arial" w:cs="Arial"/>
           <w:bCs w:val="0"/>
+          <w:noProof/>
         </w:rPr>
         <w:lastRenderedPageBreak/>
         <w:drawing>
-          <wp:inline distT="0" distB="0" distL="0" distR="0" wp14:anchorId="4514CD4B" wp14:editId="5EA4DFAE">
+          <wp:inline distT="0" distB="0" distL="0" distR="0" wp14:anchorId="4514CD4B" wp14:editId="5E66837E">
             <wp:extent cx="5400040" cy="1421130"/>
             <wp:effectExtent l="0" t="0" r="0" b="7620"/>
             <wp:docPr id="11" name="Imagen 11"/>
@@ -5510,9 +5511,10 @@
           <w:rStyle w:val="Textoennegrita"/>
           <w:rFonts w:ascii="Arial" w:hAnsi="Arial" w:cs="Arial"/>
           <w:bCs w:val="0"/>
+          <w:noProof/>
         </w:rPr>
         <w:drawing>
-          <wp:inline distT="0" distB="0" distL="0" distR="0" wp14:anchorId="4493227B" wp14:editId="3E549ED1">
+          <wp:inline distT="0" distB="0" distL="0" distR="0" wp14:anchorId="4493227B" wp14:editId="7B0DE065">
             <wp:extent cx="5400040" cy="2530475"/>
             <wp:effectExtent l="0" t="0" r="0" b="3175"/>
             <wp:docPr id="12" name="Imagen 12"/>
@@ -5563,9 +5565,10 @@
           <w:rStyle w:val="Textoennegrita"/>
           <w:rFonts w:ascii="Arial" w:hAnsi="Arial" w:cs="Arial"/>
           <w:bCs w:val="0"/>
+          <w:noProof/>
         </w:rPr>
         <w:drawing>
-          <wp:inline distT="0" distB="0" distL="0" distR="0" wp14:anchorId="66818D00" wp14:editId="5AB7F720">
+          <wp:inline distT="0" distB="0" distL="0" distR="0" wp14:anchorId="66818D00" wp14:editId="1E17149F">
             <wp:extent cx="5400040" cy="3202305"/>
             <wp:effectExtent l="0" t="0" r="0" b="0"/>
             <wp:docPr id="13" name="Imagen 13"/>
@@ -5615,24 +5618,25 @@
     <w:p>
       <w:pPr>
         <w:spacing w:line="480" w:lineRule="auto"/>
-        <w:jc w:val="both"/>
-        <w:rPr>
-          <w:rStyle w:val="Textoennegrita"/>
-          <w:rFonts w:ascii="Arial" w:hAnsi="Arial" w:cs="Arial"/>
-          <w:bCs w:val="0"/>
-        </w:rPr>
-      </w:pPr>
-      <w:r>
-        <w:rPr>
-          <w:rStyle w:val="Textoennegrita"/>
-          <w:rFonts w:ascii="Arial" w:hAnsi="Arial" w:cs="Arial"/>
-          <w:bCs w:val="0"/>
+        <w:jc w:val="center"/>
+        <w:rPr>
+          <w:rStyle w:val="Textoennegrita"/>
+          <w:rFonts w:ascii="Arial" w:hAnsi="Arial" w:cs="Arial"/>
+          <w:bCs w:val="0"/>
+        </w:rPr>
+      </w:pPr>
+      <w:r>
+        <w:rPr>
+          <w:rStyle w:val="Textoennegrita"/>
+          <w:rFonts w:ascii="Arial" w:hAnsi="Arial" w:cs="Arial"/>
+          <w:bCs w:val="0"/>
+          <w:noProof/>
         </w:rPr>
         <w:lastRenderedPageBreak/>
         <w:drawing>
-          <wp:inline distT="0" distB="0" distL="0" distR="0" wp14:anchorId="16ECB8FF" wp14:editId="3FF7F30D">
-            <wp:extent cx="5400040" cy="5244465"/>
-            <wp:effectExtent l="0" t="0" r="0" b="0"/>
+          <wp:inline distT="0" distB="0" distL="0" distR="0" wp14:anchorId="16ECB8FF" wp14:editId="728AA8C0">
+            <wp:extent cx="4970404" cy="3951605"/>
+            <wp:effectExtent l="0" t="0" r="1905" b="0"/>
             <wp:docPr id="14" name="Imagen 14"/>
             <wp:cNvGraphicFramePr>
               <a:graphicFrameLocks xmlns:a="http://schemas.openxmlformats.org/drawingml/2006/main" noChangeAspect="1"/>
@@ -5653,7 +5657,7 @@
                   <pic:spPr>
                     <a:xfrm>
                       <a:off x="0" y="0"/>
-                      <a:ext cx="5400040" cy="5244465"/>
+                      <a:ext cx="5001429" cy="3976270"/>
                     </a:xfrm>
                     <a:prstGeom prst="rect">
                       <a:avLst/>
@@ -5669,24 +5673,24 @@
     <w:p>
       <w:pPr>
         <w:spacing w:line="480" w:lineRule="auto"/>
-        <w:jc w:val="both"/>
-        <w:rPr>
-          <w:rStyle w:val="Textoennegrita"/>
-          <w:rFonts w:ascii="Arial" w:hAnsi="Arial" w:cs="Arial"/>
-          <w:bCs w:val="0"/>
-        </w:rPr>
-      </w:pPr>
-      <w:r>
-        <w:rPr>
-          <w:rStyle w:val="Textoennegrita"/>
-          <w:rFonts w:ascii="Arial" w:hAnsi="Arial" w:cs="Arial"/>
-          <w:bCs w:val="0"/>
-        </w:rPr>
-        <w:lastRenderedPageBreak/>
+        <w:jc w:val="center"/>
+        <w:rPr>
+          <w:rStyle w:val="Textoennegrita"/>
+          <w:rFonts w:ascii="Arial" w:hAnsi="Arial" w:cs="Arial"/>
+          <w:bCs w:val="0"/>
+        </w:rPr>
+      </w:pPr>
+      <w:r>
+        <w:rPr>
+          <w:rStyle w:val="Textoennegrita"/>
+          <w:rFonts w:ascii="Arial" w:hAnsi="Arial" w:cs="Arial"/>
+          <w:bCs w:val="0"/>
+          <w:noProof/>
+        </w:rPr>
         <w:drawing>
-          <wp:inline distT="0" distB="0" distL="0" distR="0" wp14:anchorId="28D51420" wp14:editId="7485A8E5">
-            <wp:extent cx="5400040" cy="3608070"/>
-            <wp:effectExtent l="0" t="0" r="0" b="0"/>
+          <wp:inline distT="0" distB="0" distL="0" distR="0" wp14:anchorId="28D51420" wp14:editId="5988B5FB">
+            <wp:extent cx="4207344" cy="3608070"/>
+            <wp:effectExtent l="0" t="0" r="3175" b="0"/>
             <wp:docPr id="15" name="Imagen 15"/>
             <wp:cNvGraphicFramePr>
               <a:graphicFrameLocks xmlns:a="http://schemas.openxmlformats.org/drawingml/2006/main" noChangeAspect="1"/>
@@ -5707,7 +5711,7 @@
                   <pic:spPr>
                     <a:xfrm>
                       <a:off x="0" y="0"/>
-                      <a:ext cx="5400040" cy="3608070"/>
+                      <a:ext cx="4241309" cy="3637197"/>
                     </a:xfrm>
                     <a:prstGeom prst="rect">
                       <a:avLst/>
@@ -5719,7 +5723,629 @@
           </wp:inline>
         </w:drawing>
       </w:r>
+    </w:p>
+    <w:p>
+      <w:pPr>
+        <w:spacing w:line="480" w:lineRule="auto"/>
+        <w:jc w:val="both"/>
+        <w:rPr>
+          <w:rStyle w:val="Textoennegrita"/>
+          <w:rFonts w:ascii="Arial" w:hAnsi="Arial" w:cs="Arial"/>
+          <w:bCs w:val="0"/>
+        </w:rPr>
+      </w:pPr>
+      <w:r>
+        <w:lastRenderedPageBreak/>
+        <w:drawing>
+          <wp:inline distT="0" distB="0" distL="0" distR="0" wp14:anchorId="1387721C" wp14:editId="16BB459C">
+            <wp:extent cx="5399689" cy="3927944"/>
+            <wp:effectExtent l="0" t="0" r="0" b="0"/>
+            <wp:docPr id="31" name="Imagen 31"/>
+            <wp:cNvGraphicFramePr>
+              <a:graphicFrameLocks xmlns:a="http://schemas.openxmlformats.org/drawingml/2006/main" noChangeAspect="1"/>
+            </wp:cNvGraphicFramePr>
+            <a:graphic xmlns:a="http://schemas.openxmlformats.org/drawingml/2006/main">
+              <a:graphicData uri="http://schemas.openxmlformats.org/drawingml/2006/picture">
+                <pic:pic xmlns:pic="http://schemas.openxmlformats.org/drawingml/2006/picture">
+                  <pic:nvPicPr>
+                    <pic:cNvPr id="1" name=""/>
+                    <pic:cNvPicPr/>
+                  </pic:nvPicPr>
+                  <pic:blipFill>
+                    <a:blip r:embed="rId21"/>
+                    <a:stretch>
+                      <a:fillRect/>
+                    </a:stretch>
+                  </pic:blipFill>
+                  <pic:spPr>
+                    <a:xfrm>
+                      <a:off x="0" y="0"/>
+                      <a:ext cx="5443820" cy="3960047"/>
+                    </a:xfrm>
+                    <a:prstGeom prst="rect">
+                      <a:avLst/>
+                    </a:prstGeom>
+                  </pic:spPr>
+                </pic:pic>
+              </a:graphicData>
+            </a:graphic>
+          </wp:inline>
+        </w:drawing>
+      </w:r>
+    </w:p>
+    <w:p>
+      <w:pPr>
+        <w:spacing w:line="480" w:lineRule="auto"/>
+        <w:jc w:val="center"/>
+        <w:rPr>
+          <w:rStyle w:val="Textoennegrita"/>
+          <w:rFonts w:ascii="Arial" w:hAnsi="Arial" w:cs="Arial"/>
+          <w:bCs w:val="0"/>
+        </w:rPr>
+      </w:pPr>
+      <w:r>
+        <w:drawing>
+          <wp:inline distT="0" distB="0" distL="0" distR="0" wp14:anchorId="773CBFF7" wp14:editId="386A74D4">
+            <wp:extent cx="3932083" cy="3705308"/>
+            <wp:effectExtent l="0" t="0" r="0" b="0"/>
+            <wp:docPr id="32" name="Imagen 32"/>
+            <wp:cNvGraphicFramePr>
+              <a:graphicFrameLocks xmlns:a="http://schemas.openxmlformats.org/drawingml/2006/main" noChangeAspect="1"/>
+            </wp:cNvGraphicFramePr>
+            <a:graphic xmlns:a="http://schemas.openxmlformats.org/drawingml/2006/main">
+              <a:graphicData uri="http://schemas.openxmlformats.org/drawingml/2006/picture">
+                <pic:pic xmlns:pic="http://schemas.openxmlformats.org/drawingml/2006/picture">
+                  <pic:nvPicPr>
+                    <pic:cNvPr id="1" name=""/>
+                    <pic:cNvPicPr/>
+                  </pic:nvPicPr>
+                  <pic:blipFill>
+                    <a:blip r:embed="rId22"/>
+                    <a:stretch>
+                      <a:fillRect/>
+                    </a:stretch>
+                  </pic:blipFill>
+                  <pic:spPr>
+                    <a:xfrm>
+                      <a:off x="0" y="0"/>
+                      <a:ext cx="3983689" cy="3753938"/>
+                    </a:xfrm>
+                    <a:prstGeom prst="rect">
+                      <a:avLst/>
+                    </a:prstGeom>
+                  </pic:spPr>
+                </pic:pic>
+              </a:graphicData>
+            </a:graphic>
+          </wp:inline>
+        </w:drawing>
+      </w:r>
+    </w:p>
+    <w:p>
+      <w:pPr>
+        <w:spacing w:line="480" w:lineRule="auto"/>
+        <w:jc w:val="center"/>
+        <w:rPr>
+          <w:rStyle w:val="Textoennegrita"/>
+          <w:rFonts w:ascii="Arial" w:hAnsi="Arial" w:cs="Arial"/>
+          <w:bCs w:val="0"/>
+        </w:rPr>
+      </w:pPr>
+      <w:r>
+        <w:lastRenderedPageBreak/>
+        <w:drawing>
+          <wp:inline distT="0" distB="0" distL="0" distR="0" wp14:anchorId="11144145" wp14:editId="24A23934">
+            <wp:extent cx="4341686" cy="3601720"/>
+            <wp:effectExtent l="0" t="0" r="1905" b="0"/>
+            <wp:docPr id="33" name="Imagen 33"/>
+            <wp:cNvGraphicFramePr>
+              <a:graphicFrameLocks xmlns:a="http://schemas.openxmlformats.org/drawingml/2006/main" noChangeAspect="1"/>
+            </wp:cNvGraphicFramePr>
+            <a:graphic xmlns:a="http://schemas.openxmlformats.org/drawingml/2006/main">
+              <a:graphicData uri="http://schemas.openxmlformats.org/drawingml/2006/picture">
+                <pic:pic xmlns:pic="http://schemas.openxmlformats.org/drawingml/2006/picture">
+                  <pic:nvPicPr>
+                    <pic:cNvPr id="1" name=""/>
+                    <pic:cNvPicPr/>
+                  </pic:nvPicPr>
+                  <pic:blipFill>
+                    <a:blip r:embed="rId23"/>
+                    <a:stretch>
+                      <a:fillRect/>
+                    </a:stretch>
+                  </pic:blipFill>
+                  <pic:spPr>
+                    <a:xfrm>
+                      <a:off x="0" y="0"/>
+                      <a:ext cx="4372665" cy="3627419"/>
+                    </a:xfrm>
+                    <a:prstGeom prst="rect">
+                      <a:avLst/>
+                    </a:prstGeom>
+                  </pic:spPr>
+                </pic:pic>
+              </a:graphicData>
+            </a:graphic>
+          </wp:inline>
+        </w:drawing>
+      </w:r>
+    </w:p>
+    <w:p>
+      <w:pPr>
+        <w:spacing w:line="480" w:lineRule="auto"/>
+        <w:jc w:val="center"/>
+        <w:rPr>
+          <w:rStyle w:val="Textoennegrita"/>
+          <w:rFonts w:ascii="Arial" w:hAnsi="Arial" w:cs="Arial"/>
+          <w:bCs w:val="0"/>
+        </w:rPr>
+      </w:pPr>
+      <w:r>
+        <w:drawing>
+          <wp:inline distT="0" distB="0" distL="0" distR="0" wp14:anchorId="42AF0CC5" wp14:editId="22B152B3">
+            <wp:extent cx="4293704" cy="3872099"/>
+            <wp:effectExtent l="0" t="0" r="0" b="0"/>
+            <wp:docPr id="6" name="Imagen 6"/>
+            <wp:cNvGraphicFramePr>
+              <a:graphicFrameLocks xmlns:a="http://schemas.openxmlformats.org/drawingml/2006/main" noChangeAspect="1"/>
+            </wp:cNvGraphicFramePr>
+            <a:graphic xmlns:a="http://schemas.openxmlformats.org/drawingml/2006/main">
+              <a:graphicData uri="http://schemas.openxmlformats.org/drawingml/2006/picture">
+                <pic:pic xmlns:pic="http://schemas.openxmlformats.org/drawingml/2006/picture">
+                  <pic:nvPicPr>
+                    <pic:cNvPr id="1" name=""/>
+                    <pic:cNvPicPr/>
+                  </pic:nvPicPr>
+                  <pic:blipFill rotWithShape="1">
+                    <a:blip r:embed="rId24"/>
+                    <a:srcRect b="15923"/>
+                    <a:stretch/>
+                  </pic:blipFill>
+                  <pic:spPr bwMode="auto">
+                    <a:xfrm>
+                      <a:off x="0" y="0"/>
+                      <a:ext cx="4310877" cy="3887586"/>
+                    </a:xfrm>
+                    <a:prstGeom prst="rect">
+                      <a:avLst/>
+                    </a:prstGeom>
+                    <a:ln>
+                      <a:noFill/>
+                    </a:ln>
+                    <a:extLst>
+                      <a:ext uri="{53640926-AAD7-44D8-BBD7-CCE9431645EC}">
+                        <a14:shadowObscured xmlns:a14="http://schemas.microsoft.com/office/drawing/2010/main"/>
+                      </a:ext>
+                    </a:extLst>
+                  </pic:spPr>
+                </pic:pic>
+              </a:graphicData>
+            </a:graphic>
+          </wp:inline>
+        </w:drawing>
+      </w:r>
+    </w:p>
+    <w:p>
+      <w:pPr>
+        <w:spacing w:line="480" w:lineRule="auto"/>
+        <w:jc w:val="center"/>
+        <w:rPr>
+          <w:rStyle w:val="Textoennegrita"/>
+          <w:rFonts w:ascii="Arial" w:hAnsi="Arial" w:cs="Arial"/>
+          <w:bCs w:val="0"/>
+        </w:rPr>
+      </w:pPr>
+      <w:r>
+        <w:rPr>
+          <w:rStyle w:val="Textoennegrita"/>
+          <w:rFonts w:ascii="Arial" w:hAnsi="Arial" w:cs="Arial"/>
+          <w:bCs w:val="0"/>
+        </w:rPr>
+        <w:lastRenderedPageBreak/>
+        <w:drawing>
+          <wp:inline distT="0" distB="0" distL="0" distR="0" wp14:anchorId="3F127FCE" wp14:editId="08582272">
+            <wp:extent cx="4246880" cy="3943847"/>
+            <wp:effectExtent l="0" t="0" r="1270" b="0"/>
+            <wp:docPr id="34" name="Imagen 34"/>
+            <wp:cNvGraphicFramePr>
+              <a:graphicFrameLocks xmlns:a="http://schemas.openxmlformats.org/drawingml/2006/main" noChangeAspect="1"/>
+            </wp:cNvGraphicFramePr>
+            <a:graphic xmlns:a="http://schemas.openxmlformats.org/drawingml/2006/main">
+              <a:graphicData uri="http://schemas.openxmlformats.org/drawingml/2006/picture">
+                <pic:pic xmlns:pic="http://schemas.openxmlformats.org/drawingml/2006/picture">
+                  <pic:nvPicPr>
+                    <pic:cNvPr id="1" name=""/>
+                    <pic:cNvPicPr/>
+                  </pic:nvPicPr>
+                  <pic:blipFill>
+                    <a:blip r:embed="rId25"/>
+                    <a:stretch>
+                      <a:fillRect/>
+                    </a:stretch>
+                  </pic:blipFill>
+                  <pic:spPr>
+                    <a:xfrm>
+                      <a:off x="0" y="0"/>
+                      <a:ext cx="4265364" cy="3961012"/>
+                    </a:xfrm>
+                    <a:prstGeom prst="rect">
+                      <a:avLst/>
+                    </a:prstGeom>
+                  </pic:spPr>
+                </pic:pic>
+              </a:graphicData>
+            </a:graphic>
+          </wp:inline>
+        </w:drawing>
+      </w:r>
+    </w:p>
+    <w:p>
+      <w:pPr>
+        <w:spacing w:line="480" w:lineRule="auto"/>
+        <w:jc w:val="center"/>
+        <w:rPr>
+          <w:rStyle w:val="Textoennegrita"/>
+          <w:rFonts w:ascii="Arial" w:hAnsi="Arial" w:cs="Arial"/>
+          <w:bCs w:val="0"/>
+        </w:rPr>
+      </w:pPr>
+      <w:r>
+        <w:drawing>
+          <wp:inline distT="0" distB="0" distL="0" distR="0" wp14:anchorId="220AF894" wp14:editId="67931835">
+            <wp:extent cx="4086232" cy="3721100"/>
+            <wp:effectExtent l="0" t="0" r="9525" b="0"/>
+            <wp:docPr id="35" name="Imagen 35"/>
+            <wp:cNvGraphicFramePr>
+              <a:graphicFrameLocks xmlns:a="http://schemas.openxmlformats.org/drawingml/2006/main" noChangeAspect="1"/>
+            </wp:cNvGraphicFramePr>
+            <a:graphic xmlns:a="http://schemas.openxmlformats.org/drawingml/2006/main">
+              <a:graphicData uri="http://schemas.openxmlformats.org/drawingml/2006/picture">
+                <pic:pic xmlns:pic="http://schemas.openxmlformats.org/drawingml/2006/picture">
+                  <pic:nvPicPr>
+                    <pic:cNvPr id="1" name=""/>
+                    <pic:cNvPicPr/>
+                  </pic:nvPicPr>
+                  <pic:blipFill rotWithShape="1">
+                    <a:blip r:embed="rId26"/>
+                    <a:srcRect t="2520" r="11360" b="12910"/>
+                    <a:stretch/>
+                  </pic:blipFill>
+                  <pic:spPr bwMode="auto">
+                    <a:xfrm>
+                      <a:off x="0" y="0"/>
+                      <a:ext cx="4099513" cy="3733194"/>
+                    </a:xfrm>
+                    <a:prstGeom prst="rect">
+                      <a:avLst/>
+                    </a:prstGeom>
+                    <a:ln>
+                      <a:noFill/>
+                    </a:ln>
+                    <a:extLst>
+                      <a:ext uri="{53640926-AAD7-44D8-BBD7-CCE9431645EC}">
+                        <a14:shadowObscured xmlns:a14="http://schemas.microsoft.com/office/drawing/2010/main"/>
+                      </a:ext>
+                    </a:extLst>
+                  </pic:spPr>
+                </pic:pic>
+              </a:graphicData>
+            </a:graphic>
+          </wp:inline>
+        </w:drawing>
+      </w:r>
+    </w:p>
+    <w:p>
+      <w:pPr>
+        <w:spacing w:line="480" w:lineRule="auto"/>
+        <w:jc w:val="both"/>
+        <w:rPr>
+          <w:rStyle w:val="Textoennegrita"/>
+          <w:rFonts w:ascii="Arial" w:hAnsi="Arial" w:cs="Arial"/>
+          <w:bCs w:val="0"/>
+        </w:rPr>
+      </w:pPr>
+      <w:r>
+        <w:lastRenderedPageBreak/>
+        <w:drawing>
+          <wp:inline distT="0" distB="0" distL="0" distR="0" wp14:anchorId="2A3A17C3" wp14:editId="053C8B89">
+            <wp:extent cx="5399374" cy="3260035"/>
+            <wp:effectExtent l="0" t="0" r="0" b="0"/>
+            <wp:docPr id="36" name="Imagen 36"/>
+            <wp:cNvGraphicFramePr>
+              <a:graphicFrameLocks xmlns:a="http://schemas.openxmlformats.org/drawingml/2006/main" noChangeAspect="1"/>
+            </wp:cNvGraphicFramePr>
+            <a:graphic xmlns:a="http://schemas.openxmlformats.org/drawingml/2006/main">
+              <a:graphicData uri="http://schemas.openxmlformats.org/drawingml/2006/picture">
+                <pic:pic xmlns:pic="http://schemas.openxmlformats.org/drawingml/2006/picture">
+                  <pic:nvPicPr>
+                    <pic:cNvPr id="1" name=""/>
+                    <pic:cNvPicPr/>
+                  </pic:nvPicPr>
+                  <pic:blipFill>
+                    <a:blip r:embed="rId27"/>
+                    <a:stretch>
+                      <a:fillRect/>
+                    </a:stretch>
+                  </pic:blipFill>
+                  <pic:spPr>
+                    <a:xfrm>
+                      <a:off x="0" y="0"/>
+                      <a:ext cx="5434749" cy="3281394"/>
+                    </a:xfrm>
+                    <a:prstGeom prst="rect">
+                      <a:avLst/>
+                    </a:prstGeom>
+                  </pic:spPr>
+                </pic:pic>
+              </a:graphicData>
+            </a:graphic>
+          </wp:inline>
+        </w:drawing>
+      </w:r>
+    </w:p>
+    <w:p>
+      <w:pPr>
+        <w:spacing w:line="480" w:lineRule="auto"/>
+        <w:jc w:val="both"/>
+        <w:rPr>
+          <w:rStyle w:val="Textoennegrita"/>
+          <w:rFonts w:ascii="Arial" w:hAnsi="Arial" w:cs="Arial"/>
+          <w:bCs w:val="0"/>
+        </w:rPr>
+      </w:pPr>
+      <w:r>
+        <w:drawing>
+          <wp:inline distT="0" distB="0" distL="0" distR="0" wp14:anchorId="12034AF9" wp14:editId="3E608C8B">
+            <wp:extent cx="5399594" cy="3959750"/>
+            <wp:effectExtent l="0" t="0" r="0" b="3175"/>
+            <wp:docPr id="37" name="Imagen 37"/>
+            <wp:cNvGraphicFramePr>
+              <a:graphicFrameLocks xmlns:a="http://schemas.openxmlformats.org/drawingml/2006/main" noChangeAspect="1"/>
+            </wp:cNvGraphicFramePr>
+            <a:graphic xmlns:a="http://schemas.openxmlformats.org/drawingml/2006/main">
+              <a:graphicData uri="http://schemas.openxmlformats.org/drawingml/2006/picture">
+                <pic:pic xmlns:pic="http://schemas.openxmlformats.org/drawingml/2006/picture">
+                  <pic:nvPicPr>
+                    <pic:cNvPr id="1" name=""/>
+                    <pic:cNvPicPr/>
+                  </pic:nvPicPr>
+                  <pic:blipFill>
+                    <a:blip r:embed="rId28"/>
+                    <a:stretch>
+                      <a:fillRect/>
+                    </a:stretch>
+                  </pic:blipFill>
+                  <pic:spPr>
+                    <a:xfrm>
+                      <a:off x="0" y="0"/>
+                      <a:ext cx="5415099" cy="3971121"/>
+                    </a:xfrm>
+                    <a:prstGeom prst="rect">
+                      <a:avLst/>
+                    </a:prstGeom>
+                  </pic:spPr>
+                </pic:pic>
+              </a:graphicData>
+            </a:graphic>
+          </wp:inline>
+        </w:drawing>
+      </w:r>
+    </w:p>
+    <w:p>
+      <w:pPr>
+        <w:spacing w:line="480" w:lineRule="auto"/>
+        <w:jc w:val="center"/>
+        <w:rPr>
+          <w:rStyle w:val="Textoennegrita"/>
+          <w:rFonts w:ascii="Arial" w:hAnsi="Arial" w:cs="Arial"/>
+          <w:bCs w:val="0"/>
+        </w:rPr>
+      </w:pPr>
+      <w:r>
+        <w:lastRenderedPageBreak/>
+        <w:drawing>
+          <wp:inline distT="0" distB="0" distL="0" distR="0" wp14:anchorId="0A415619" wp14:editId="7B2D0800">
+            <wp:extent cx="4548296" cy="4023360"/>
+            <wp:effectExtent l="0" t="0" r="5080" b="0"/>
+            <wp:docPr id="38" name="Imagen 38"/>
+            <wp:cNvGraphicFramePr>
+              <a:graphicFrameLocks xmlns:a="http://schemas.openxmlformats.org/drawingml/2006/main" noChangeAspect="1"/>
+            </wp:cNvGraphicFramePr>
+            <a:graphic xmlns:a="http://schemas.openxmlformats.org/drawingml/2006/main">
+              <a:graphicData uri="http://schemas.openxmlformats.org/drawingml/2006/picture">
+                <pic:pic xmlns:pic="http://schemas.openxmlformats.org/drawingml/2006/picture">
+                  <pic:nvPicPr>
+                    <pic:cNvPr id="1" name=""/>
+                    <pic:cNvPicPr/>
+                  </pic:nvPicPr>
+                  <pic:blipFill>
+                    <a:blip r:embed="rId29"/>
+                    <a:stretch>
+                      <a:fillRect/>
+                    </a:stretch>
+                  </pic:blipFill>
+                  <pic:spPr>
+                    <a:xfrm>
+                      <a:off x="0" y="0"/>
+                      <a:ext cx="4591853" cy="4061890"/>
+                    </a:xfrm>
+                    <a:prstGeom prst="rect">
+                      <a:avLst/>
+                    </a:prstGeom>
+                  </pic:spPr>
+                </pic:pic>
+              </a:graphicData>
+            </a:graphic>
+          </wp:inline>
+        </w:drawing>
+      </w:r>
+    </w:p>
+    <w:p>
+      <w:pPr>
+        <w:spacing w:line="480" w:lineRule="auto"/>
+        <w:jc w:val="center"/>
+        <w:rPr>
+          <w:rStyle w:val="Textoennegrita"/>
+          <w:rFonts w:ascii="Arial" w:hAnsi="Arial" w:cs="Arial"/>
+          <w:bCs w:val="0"/>
+        </w:rPr>
+      </w:pPr>
+      <w:r>
+        <w:drawing>
+          <wp:inline distT="0" distB="0" distL="0" distR="0" wp14:anchorId="59EBC074" wp14:editId="5E40B74F">
+            <wp:extent cx="4579620" cy="2767054"/>
+            <wp:effectExtent l="0" t="0" r="0" b="0"/>
+            <wp:docPr id="39" name="Imagen 39"/>
+            <wp:cNvGraphicFramePr>
+              <a:graphicFrameLocks xmlns:a="http://schemas.openxmlformats.org/drawingml/2006/main" noChangeAspect="1"/>
+            </wp:cNvGraphicFramePr>
+            <a:graphic xmlns:a="http://schemas.openxmlformats.org/drawingml/2006/main">
+              <a:graphicData uri="http://schemas.openxmlformats.org/drawingml/2006/picture">
+                <pic:pic xmlns:pic="http://schemas.openxmlformats.org/drawingml/2006/picture">
+                  <pic:nvPicPr>
+                    <pic:cNvPr id="1" name=""/>
+                    <pic:cNvPicPr/>
+                  </pic:nvPicPr>
+                  <pic:blipFill>
+                    <a:blip r:embed="rId30"/>
+                    <a:stretch>
+                      <a:fillRect/>
+                    </a:stretch>
+                  </pic:blipFill>
+                  <pic:spPr>
+                    <a:xfrm>
+                      <a:off x="0" y="0"/>
+                      <a:ext cx="4637967" cy="2802308"/>
+                    </a:xfrm>
+                    <a:prstGeom prst="rect">
+                      <a:avLst/>
+                    </a:prstGeom>
+                  </pic:spPr>
+                </pic:pic>
+              </a:graphicData>
+            </a:graphic>
+          </wp:inline>
+        </w:drawing>
+      </w:r>
+    </w:p>
+    <w:p>
+      <w:pPr>
+        <w:spacing w:line="480" w:lineRule="auto"/>
+        <w:jc w:val="both"/>
+        <w:rPr>
+          <w:rStyle w:val="Textoennegrita"/>
+          <w:rFonts w:ascii="Arial" w:hAnsi="Arial" w:cs="Arial"/>
+          <w:bCs w:val="0"/>
+        </w:rPr>
+      </w:pPr>
+    </w:p>
+    <w:p>
+      <w:pPr>
+        <w:spacing w:line="480" w:lineRule="auto"/>
+        <w:jc w:val="center"/>
+        <w:rPr>
+          <w:rStyle w:val="Textoennegrita"/>
+          <w:rFonts w:ascii="Arial" w:hAnsi="Arial" w:cs="Arial"/>
+          <w:bCs w:val="0"/>
+        </w:rPr>
+      </w:pPr>
+      <w:r>
+        <w:lastRenderedPageBreak/>
+        <w:drawing>
+          <wp:inline distT="0" distB="0" distL="0" distR="0" wp14:anchorId="669EFBAA" wp14:editId="75C81E3C">
+            <wp:extent cx="4651538" cy="2240915"/>
+            <wp:effectExtent l="0" t="0" r="0" b="6985"/>
+            <wp:docPr id="40" name="Imagen 40"/>
+            <wp:cNvGraphicFramePr>
+              <a:graphicFrameLocks xmlns:a="http://schemas.openxmlformats.org/drawingml/2006/main" noChangeAspect="1"/>
+            </wp:cNvGraphicFramePr>
+            <a:graphic xmlns:a="http://schemas.openxmlformats.org/drawingml/2006/main">
+              <a:graphicData uri="http://schemas.openxmlformats.org/drawingml/2006/picture">
+                <pic:pic xmlns:pic="http://schemas.openxmlformats.org/drawingml/2006/picture">
+                  <pic:nvPicPr>
+                    <pic:cNvPr id="1" name=""/>
+                    <pic:cNvPicPr/>
+                  </pic:nvPicPr>
+                  <pic:blipFill>
+                    <a:blip r:embed="rId31"/>
+                    <a:stretch>
+                      <a:fillRect/>
+                    </a:stretch>
+                  </pic:blipFill>
+                  <pic:spPr>
+                    <a:xfrm>
+                      <a:off x="0" y="0"/>
+                      <a:ext cx="4662656" cy="2246271"/>
+                    </a:xfrm>
+                    <a:prstGeom prst="rect">
+                      <a:avLst/>
+                    </a:prstGeom>
+                  </pic:spPr>
+                </pic:pic>
+              </a:graphicData>
+            </a:graphic>
+          </wp:inline>
+        </w:drawing>
+      </w:r>
+    </w:p>
+    <w:p>
+      <w:pPr>
+        <w:spacing w:line="480" w:lineRule="auto"/>
+        <w:jc w:val="center"/>
+        <w:rPr>
+          <w:rStyle w:val="Textoennegrita"/>
+          <w:rFonts w:ascii="Arial" w:hAnsi="Arial" w:cs="Arial"/>
+          <w:bCs w:val="0"/>
+        </w:rPr>
+      </w:pPr>
       <w:bookmarkStart w:id="0" w:name="_GoBack"/>
+      <w:r>
+        <w:rPr>
+          <w:noProof/>
+        </w:rPr>
+        <w:drawing>
+          <wp:inline distT="0" distB="0" distL="0" distR="0" wp14:anchorId="34AF7EEE" wp14:editId="004E4D93">
+            <wp:extent cx="4572912" cy="2730500"/>
+            <wp:effectExtent l="0" t="0" r="0" b="0"/>
+            <wp:docPr id="41" name="Imagen 41"/>
+            <wp:cNvGraphicFramePr>
+              <a:graphicFrameLocks xmlns:a="http://schemas.openxmlformats.org/drawingml/2006/main" noChangeAspect="1"/>
+            </wp:cNvGraphicFramePr>
+            <a:graphic xmlns:a="http://schemas.openxmlformats.org/drawingml/2006/main">
+              <a:graphicData uri="http://schemas.openxmlformats.org/drawingml/2006/picture">
+                <pic:pic xmlns:pic="http://schemas.openxmlformats.org/drawingml/2006/picture">
+                  <pic:nvPicPr>
+                    <pic:cNvPr id="1" name=""/>
+                    <pic:cNvPicPr/>
+                  </pic:nvPicPr>
+                  <pic:blipFill rotWithShape="1">
+                    <a:blip r:embed="rId32"/>
+                    <a:srcRect b="54514"/>
+                    <a:stretch/>
+                  </pic:blipFill>
+                  <pic:spPr bwMode="auto">
+                    <a:xfrm>
+                      <a:off x="0" y="0"/>
+                      <a:ext cx="4591997" cy="2741896"/>
+                    </a:xfrm>
+                    <a:prstGeom prst="rect">
+                      <a:avLst/>
+                    </a:prstGeom>
+                    <a:ln>
+                      <a:noFill/>
+                    </a:ln>
+                    <a:extLst>
+                      <a:ext uri="{53640926-AAD7-44D8-BBD7-CCE9431645EC}">
+                        <a14:shadowObscured xmlns:a14="http://schemas.microsoft.com/office/drawing/2010/main"/>
+                      </a:ext>
+                    </a:extLst>
+                  </pic:spPr>
+                </pic:pic>
+              </a:graphicData>
+            </a:graphic>
+          </wp:inline>
+        </w:drawing>
+      </w:r>
       <w:bookmarkEnd w:id="0"/>
     </w:p>
     <w:p>
@@ -5812,8 +6438,8 @@
       </w:pPr>
     </w:p>
     <w:sectPr>
-      <w:headerReference w:type="default" r:id="rId21"/>
-      <w:footerReference w:type="default" r:id="rId22"/>
+      <w:headerReference w:type="default" r:id="rId33"/>
+      <w:footerReference w:type="default" r:id="rId34"/>
       <w:pgSz w:w="11906" w:h="16838"/>
       <w:pgMar w:top="1105" w:right="1701" w:bottom="1417" w:left="1701" w:header="0" w:footer="1132" w:gutter="0"/>
       <w:cols w:space="708"/>
@@ -10728,7 +11354,7 @@
 </file>
 
 <file path=customXml/itemProps1.xml><?xml version="1.0" encoding="utf-8"?>
-<ds:datastoreItem xmlns:ds="http://schemas.openxmlformats.org/officeDocument/2006/customXml" ds:itemID="{81167EA3-CBD4-408B-A287-1EF2DB3D90BD}">
+<ds:datastoreItem xmlns:ds="http://schemas.openxmlformats.org/officeDocument/2006/customXml" ds:itemID="{A5906C84-8BFF-4A01-87BC-40D48CB8DB27}">
   <ds:schemaRefs>
     <ds:schemaRef ds:uri="http://schemas.openxmlformats.org/officeDocument/2006/bibliography"/>
   </ds:schemaRefs>

</xml_diff>

<commit_message>
segundo cambio: se agrego las ultimas capturas de la tarea
</commit_message>
<xml_diff>
--- a/TAREA 1/ACTIVIDAD 1.docx
+++ b/TAREA 1/ACTIVIDAD 1.docx
@@ -432,7 +432,7 @@
               </wp:anchor>
             </w:drawing>
           </mc:Choice>
-          <mc:Fallback xmlns:w16sdtfl="http://schemas.microsoft.com/office/word/2024/wordml/sdtformatlock" xmlns:w16sdtdh="http://schemas.microsoft.com/office/word/2020/wordml/sdtdatahash" xmlns:w16du="http://schemas.microsoft.com/office/word/2023/wordml/word16du" xmlns:w16="http://schemas.microsoft.com/office/word/2018/wordml" xmlns:w16cex="http://schemas.microsoft.com/office/word/2018/wordml/cex" xmlns:oel="http://schemas.microsoft.com/office/2019/extlst">
+          <mc:Fallback xmlns:oel="http://schemas.microsoft.com/office/2019/extlst" xmlns:w16cex="http://schemas.microsoft.com/office/word/2018/wordml/cex" xmlns:w16="http://schemas.microsoft.com/office/word/2018/wordml" xmlns:w16du="http://schemas.microsoft.com/office/word/2023/wordml/word16du" xmlns:w16sdtdh="http://schemas.microsoft.com/office/word/2020/wordml/sdtdatahash" xmlns:w16sdtfl="http://schemas.microsoft.com/office/word/2024/wordml/sdtformatlock">
             <w:pict>
               <v:line w14:anchorId="4F4BF739" id="Conector recto 6" o:spid="_x0000_s1026" style="position:absolute;flip:y;z-index:251659264;visibility:visible;mso-wrap-style:square;mso-width-percent:0;mso-height-percent:0;mso-wrap-distance-left:9pt;mso-wrap-distance-top:0;mso-wrap-distance-right:9pt;mso-wrap-distance-bottom:0;mso-position-horizontal:absolute;mso-position-horizontal-relative:text;mso-position-vertical:absolute;mso-position-vertical-relative:text;mso-width-percent:0;mso-height-percent:0;mso-width-relative:margin;mso-height-relative:margin" from="1.75pt,20.8pt" to="415.15pt,20.8pt" o:gfxdata="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" strokecolor="#196b24 [3206]" strokeweight="1.5pt">
                 <v:stroke joinstyle="miter"/>
@@ -564,7 +564,7 @@
               </wp:anchor>
             </w:drawing>
           </mc:Choice>
-          <mc:Fallback xmlns:w16sdtfl="http://schemas.microsoft.com/office/word/2024/wordml/sdtformatlock" xmlns:w16sdtdh="http://schemas.microsoft.com/office/word/2020/wordml/sdtdatahash" xmlns:w16du="http://schemas.microsoft.com/office/word/2023/wordml/word16du" xmlns:w16="http://schemas.microsoft.com/office/word/2018/wordml" xmlns:w16cex="http://schemas.microsoft.com/office/word/2018/wordml/cex" xmlns:oel="http://schemas.microsoft.com/office/2019/extlst">
+          <mc:Fallback xmlns:oel="http://schemas.microsoft.com/office/2019/extlst" xmlns:w16cex="http://schemas.microsoft.com/office/word/2018/wordml/cex" xmlns:w16="http://schemas.microsoft.com/office/word/2018/wordml" xmlns:w16du="http://schemas.microsoft.com/office/word/2023/wordml/word16du" xmlns:w16sdtdh="http://schemas.microsoft.com/office/word/2020/wordml/sdtdatahash" xmlns:w16sdtfl="http://schemas.microsoft.com/office/word/2024/wordml/sdtformatlock">
             <w:pict>
               <v:line w14:anchorId="285DFDE2" id="Conector recto 6" o:spid="_x0000_s1026" style="position:absolute;flip:y;z-index:251661312;visibility:visible;mso-wrap-style:square;mso-width-percent:0;mso-height-percent:0;mso-wrap-distance-left:9pt;mso-wrap-distance-top:0;mso-wrap-distance-right:9pt;mso-wrap-distance-bottom:0;mso-position-horizontal:absolute;mso-position-horizontal-relative:text;mso-position-vertical:absolute;mso-position-vertical-relative:text;mso-width-percent:0;mso-height-percent:0;mso-width-relative:margin;mso-height-relative:margin" from="0,-.05pt" to="413.4pt,-.05pt" o:gfxdata="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" strokecolor="#196b24 [3206]" strokeweight="1.5pt">
                 <v:stroke joinstyle="miter"/>
@@ -5735,6 +5735,9 @@
         </w:rPr>
       </w:pPr>
       <w:r>
+        <w:rPr>
+          <w:noProof/>
+        </w:rPr>
         <w:lastRenderedPageBreak/>
         <w:drawing>
           <wp:inline distT="0" distB="0" distL="0" distR="0" wp14:anchorId="1387721C" wp14:editId="16BB459C">
@@ -5784,6 +5787,9 @@
         </w:rPr>
       </w:pPr>
       <w:r>
+        <w:rPr>
+          <w:noProof/>
+        </w:rPr>
         <w:drawing>
           <wp:inline distT="0" distB="0" distL="0" distR="0" wp14:anchorId="773CBFF7" wp14:editId="386A74D4">
             <wp:extent cx="3932083" cy="3705308"/>
@@ -5832,6 +5838,9 @@
         </w:rPr>
       </w:pPr>
       <w:r>
+        <w:rPr>
+          <w:noProof/>
+        </w:rPr>
         <w:lastRenderedPageBreak/>
         <w:drawing>
           <wp:inline distT="0" distB="0" distL="0" distR="0" wp14:anchorId="11144145" wp14:editId="24A23934">
@@ -5881,6 +5890,9 @@
         </w:rPr>
       </w:pPr>
       <w:r>
+        <w:rPr>
+          <w:noProof/>
+        </w:rPr>
         <w:drawing>
           <wp:inline distT="0" distB="0" distL="0" distR="0" wp14:anchorId="42AF0CC5" wp14:editId="22B152B3">
             <wp:extent cx="4293704" cy="3872099"/>
@@ -5940,6 +5952,7 @@
           <w:rStyle w:val="Textoennegrita"/>
           <w:rFonts w:ascii="Arial" w:hAnsi="Arial" w:cs="Arial"/>
           <w:bCs w:val="0"/>
+          <w:noProof/>
         </w:rPr>
         <w:lastRenderedPageBreak/>
         <w:drawing>
@@ -5990,6 +6003,9 @@
         </w:rPr>
       </w:pPr>
       <w:r>
+        <w:rPr>
+          <w:noProof/>
+        </w:rPr>
         <w:drawing>
           <wp:inline distT="0" distB="0" distL="0" distR="0" wp14:anchorId="220AF894" wp14:editId="67931835">
             <wp:extent cx="4086232" cy="3721100"/>
@@ -6045,6 +6061,9 @@
         </w:rPr>
       </w:pPr>
       <w:r>
+        <w:rPr>
+          <w:noProof/>
+        </w:rPr>
         <w:lastRenderedPageBreak/>
         <w:drawing>
           <wp:inline distT="0" distB="0" distL="0" distR="0" wp14:anchorId="2A3A17C3" wp14:editId="053C8B89">
@@ -6094,6 +6113,9 @@
         </w:rPr>
       </w:pPr>
       <w:r>
+        <w:rPr>
+          <w:noProof/>
+        </w:rPr>
         <w:drawing>
           <wp:inline distT="0" distB="0" distL="0" distR="0" wp14:anchorId="12034AF9" wp14:editId="3E608C8B">
             <wp:extent cx="5399594" cy="3959750"/>
@@ -6142,6 +6164,9 @@
         </w:rPr>
       </w:pPr>
       <w:r>
+        <w:rPr>
+          <w:noProof/>
+        </w:rPr>
         <w:lastRenderedPageBreak/>
         <w:drawing>
           <wp:inline distT="0" distB="0" distL="0" distR="0" wp14:anchorId="0A415619" wp14:editId="7B2D0800">
@@ -6191,6 +6216,9 @@
         </w:rPr>
       </w:pPr>
       <w:r>
+        <w:rPr>
+          <w:noProof/>
+        </w:rPr>
         <w:drawing>
           <wp:inline distT="0" distB="0" distL="0" distR="0" wp14:anchorId="59EBC074" wp14:editId="5E40B74F">
             <wp:extent cx="4579620" cy="2767054"/>
@@ -6250,11 +6278,14 @@
         </w:rPr>
       </w:pPr>
       <w:r>
+        <w:rPr>
+          <w:noProof/>
+        </w:rPr>
         <w:lastRenderedPageBreak/>
         <w:drawing>
-          <wp:inline distT="0" distB="0" distL="0" distR="0" wp14:anchorId="669EFBAA" wp14:editId="75C81E3C">
-            <wp:extent cx="4651538" cy="2240915"/>
-            <wp:effectExtent l="0" t="0" r="0" b="6985"/>
+          <wp:inline distT="0" distB="0" distL="0" distR="0" wp14:anchorId="669EFBAA" wp14:editId="041B541D">
+            <wp:extent cx="4651375" cy="1908313"/>
+            <wp:effectExtent l="0" t="0" r="0" b="0"/>
             <wp:docPr id="40" name="Imagen 40"/>
             <wp:cNvGraphicFramePr>
               <a:graphicFrameLocks xmlns:a="http://schemas.openxmlformats.org/drawingml/2006/main" noChangeAspect="1"/>
@@ -6275,7 +6306,7 @@
                   <pic:spPr>
                     <a:xfrm>
                       <a:off x="0" y="0"/>
-                      <a:ext cx="4662656" cy="2246271"/>
+                      <a:ext cx="4682047" cy="1920897"/>
                     </a:xfrm>
                     <a:prstGeom prst="rect">
                       <a:avLst/>
@@ -6293,20 +6324,17 @@
         <w:spacing w:line="480" w:lineRule="auto"/>
         <w:jc w:val="center"/>
         <w:rPr>
-          <w:rStyle w:val="Textoennegrita"/>
-          <w:rFonts w:ascii="Arial" w:hAnsi="Arial" w:cs="Arial"/>
-          <w:bCs w:val="0"/>
-        </w:rPr>
-      </w:pPr>
-      <w:bookmarkStart w:id="0" w:name="_GoBack"/>
-      <w:r>
-        <w:rPr>
           <w:noProof/>
         </w:rPr>
+      </w:pPr>
+      <w:r>
+        <w:rPr>
+          <w:noProof/>
+        </w:rPr>
         <w:drawing>
-          <wp:inline distT="0" distB="0" distL="0" distR="0" wp14:anchorId="34AF7EEE" wp14:editId="004E4D93">
-            <wp:extent cx="4572912" cy="2730500"/>
-            <wp:effectExtent l="0" t="0" r="0" b="0"/>
+          <wp:inline distT="0" distB="0" distL="0" distR="0" wp14:anchorId="34AF7EEE" wp14:editId="6FF2C537">
+            <wp:extent cx="4571571" cy="2170707"/>
+            <wp:effectExtent l="0" t="0" r="635" b="1270"/>
             <wp:docPr id="41" name="Imagen 41"/>
             <wp:cNvGraphicFramePr>
               <a:graphicFrameLocks xmlns:a="http://schemas.openxmlformats.org/drawingml/2006/main" noChangeAspect="1"/>
@@ -6326,7 +6354,7 @@
                   <pic:spPr bwMode="auto">
                     <a:xfrm>
                       <a:off x="0" y="0"/>
-                      <a:ext cx="4591997" cy="2741896"/>
+                      <a:ext cx="4642989" cy="2204618"/>
                     </a:xfrm>
                     <a:prstGeom prst="rect">
                       <a:avLst/>
@@ -6346,7 +6374,60 @@
           </wp:inline>
         </w:drawing>
       </w:r>
-      <w:bookmarkEnd w:id="0"/>
+    </w:p>
+    <w:p>
+      <w:pPr>
+        <w:spacing w:line="480" w:lineRule="auto"/>
+        <w:jc w:val="center"/>
+        <w:rPr>
+          <w:rStyle w:val="Textoennegrita"/>
+          <w:rFonts w:ascii="Arial" w:hAnsi="Arial" w:cs="Arial"/>
+          <w:bCs w:val="0"/>
+        </w:rPr>
+      </w:pPr>
+      <w:r>
+        <w:rPr>
+          <w:rStyle w:val="Textoennegrita"/>
+          <w:rFonts w:ascii="Arial" w:hAnsi="Arial" w:cs="Arial"/>
+          <w:bCs w:val="0"/>
+          <w:noProof/>
+        </w:rPr>
+        <w:drawing>
+          <wp:inline distT="0" distB="0" distL="0" distR="0" wp14:anchorId="2722A3E6" wp14:editId="390953F3">
+            <wp:extent cx="5400040" cy="3085465"/>
+            <wp:effectExtent l="0" t="0" r="0" b="635"/>
+            <wp:docPr id="42" name="Imagen 42"/>
+            <wp:cNvGraphicFramePr>
+              <a:graphicFrameLocks xmlns:a="http://schemas.openxmlformats.org/drawingml/2006/main" noChangeAspect="1"/>
+            </wp:cNvGraphicFramePr>
+            <a:graphic xmlns:a="http://schemas.openxmlformats.org/drawingml/2006/main">
+              <a:graphicData uri="http://schemas.openxmlformats.org/drawingml/2006/picture">
+                <pic:pic xmlns:pic="http://schemas.openxmlformats.org/drawingml/2006/picture">
+                  <pic:nvPicPr>
+                    <pic:cNvPr id="1" name=""/>
+                    <pic:cNvPicPr/>
+                  </pic:nvPicPr>
+                  <pic:blipFill>
+                    <a:blip r:embed="rId33"/>
+                    <a:stretch>
+                      <a:fillRect/>
+                    </a:stretch>
+                  </pic:blipFill>
+                  <pic:spPr>
+                    <a:xfrm>
+                      <a:off x="0" y="0"/>
+                      <a:ext cx="5400040" cy="3085465"/>
+                    </a:xfrm>
+                    <a:prstGeom prst="rect">
+                      <a:avLst/>
+                    </a:prstGeom>
+                  </pic:spPr>
+                </pic:pic>
+              </a:graphicData>
+            </a:graphic>
+          </wp:inline>
+        </w:drawing>
+      </w:r>
     </w:p>
     <w:p>
       <w:pPr>
@@ -6358,12 +6439,26 @@
           <w:bCs w:val="0"/>
         </w:rPr>
       </w:pPr>
-      <w:r>
-        <w:rPr>
-          <w:rStyle w:val="Textoennegrita"/>
-          <w:rFonts w:ascii="Arial" w:hAnsi="Arial" w:cs="Arial"/>
-          <w:bCs w:val="0"/>
-        </w:rPr>
+    </w:p>
+    <w:p>
+      <w:pPr>
+        <w:spacing w:line="480" w:lineRule="auto"/>
+        <w:jc w:val="both"/>
+        <w:rPr>
+          <w:rStyle w:val="Textoennegrita"/>
+          <w:rFonts w:ascii="Arial" w:hAnsi="Arial" w:cs="Arial"/>
+          <w:bCs w:val="0"/>
+        </w:rPr>
+      </w:pPr>
+      <w:bookmarkStart w:id="0" w:name="_GoBack"/>
+      <w:bookmarkEnd w:id="0"/>
+      <w:r>
+        <w:rPr>
+          <w:rStyle w:val="Textoennegrita"/>
+          <w:rFonts w:ascii="Arial" w:hAnsi="Arial" w:cs="Arial"/>
+          <w:bCs w:val="0"/>
+        </w:rPr>
+        <w:lastRenderedPageBreak/>
         <w:t>Referencia bibliográfica</w:t>
       </w:r>
     </w:p>
@@ -6438,8 +6533,8 @@
       </w:pPr>
     </w:p>
     <w:sectPr>
-      <w:headerReference w:type="default" r:id="rId33"/>
-      <w:footerReference w:type="default" r:id="rId34"/>
+      <w:headerReference w:type="default" r:id="rId34"/>
+      <w:footerReference w:type="default" r:id="rId35"/>
       <w:pgSz w:w="11906" w:h="16838"/>
       <w:pgMar w:top="1105" w:right="1701" w:bottom="1417" w:left="1701" w:header="0" w:footer="1132" w:gutter="0"/>
       <w:cols w:space="708"/>
@@ -6561,7 +6656,7 @@
                 </wp:anchor>
               </w:drawing>
             </mc:Choice>
-            <mc:Fallback xmlns:w16sdtfl="http://schemas.microsoft.com/office/word/2024/wordml/sdtformatlock" xmlns:w16sdtdh="http://schemas.microsoft.com/office/word/2020/wordml/sdtdatahash" xmlns:w16du="http://schemas.microsoft.com/office/word/2023/wordml/word16du" xmlns:w16="http://schemas.microsoft.com/office/word/2018/wordml" xmlns:w16cex="http://schemas.microsoft.com/office/word/2018/wordml/cex" xmlns:oel="http://schemas.microsoft.com/office/2019/extlst">
+            <mc:Fallback xmlns:oel="http://schemas.microsoft.com/office/2019/extlst" xmlns:w16cex="http://schemas.microsoft.com/office/word/2018/wordml/cex" xmlns:w16="http://schemas.microsoft.com/office/word/2018/wordml" xmlns:w16du="http://schemas.microsoft.com/office/word/2023/wordml/word16du" xmlns:w16sdtdh="http://schemas.microsoft.com/office/word/2020/wordml/sdtdatahash" xmlns:w16sdtfl="http://schemas.microsoft.com/office/word/2024/wordml/sdtformatlock">
               <w:pict>
                 <v:rect w14:anchorId="7F150C23" id="Rectángulo 5" o:spid="_x0000_s1026" style="position:absolute;margin-left:0;margin-top:.8pt;width:454.35pt;height:18.6pt;z-index:251659264;visibility:visible;mso-wrap-style:square;mso-width-percent:0;mso-height-percent:0;mso-wrap-distance-left:9pt;mso-wrap-distance-top:0;mso-wrap-distance-right:9pt;mso-wrap-distance-bottom:0;mso-position-horizontal:left;mso-position-horizontal-relative:margin;mso-position-vertical:absolute;mso-position-vertical-relative:text;mso-width-percent:0;mso-height-percent:0;mso-width-relative:margin;mso-height-relative:margin;v-text-anchor:middle" o:gfxdata="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" fillcolor="yellow" strokecolor="#030e13 [484]" strokeweight="1pt">
                   <w10:wrap anchorx="margin"/>
@@ -11354,7 +11449,7 @@
 </file>
 
 <file path=customXml/itemProps1.xml><?xml version="1.0" encoding="utf-8"?>
-<ds:datastoreItem xmlns:ds="http://schemas.openxmlformats.org/officeDocument/2006/customXml" ds:itemID="{A5906C84-8BFF-4A01-87BC-40D48CB8DB27}">
+<ds:datastoreItem xmlns:ds="http://schemas.openxmlformats.org/officeDocument/2006/customXml" ds:itemID="{D783238C-C1F6-4A37-B436-1177B7264BEF}">
   <ds:schemaRefs>
     <ds:schemaRef ds:uri="http://schemas.openxmlformats.org/officeDocument/2006/bibliography"/>
   </ds:schemaRefs>

</xml_diff>